<commit_message>
docs: refresh Word draft with current evidence
</commit_message>
<xml_diff>
--- a/paper/论文初稿.docx
+++ b/paper/论文初稿.docx
@@ -2,7 +2,7 @@
 <file path=word/document.xml><?xml version="1.0" encoding="utf-8"?>
 <w:document xmlns:w="http://schemas.openxmlformats.org/wordprocessingml/2006/main" xmlns:m="http://schemas.openxmlformats.org/officeDocument/2006/math" xmlns:r="http://schemas.openxmlformats.org/officeDocument/2006/relationships" xmlns:o="urn:schemas-microsoft-com:office:office" xmlns:v="urn:schemas-microsoft-com:vml" xmlns:w10="urn:schemas-microsoft-com:office:word" xmlns:a="http://schemas.openxmlformats.org/drawingml/2006/main" xmlns:pic="http://schemas.openxmlformats.org/drawingml/2006/picture" xmlns:wp="http://schemas.openxmlformats.org/drawingml/2006/wordprocessingDrawing">
   <w:body>
-    <w:bookmarkStart w:id="25" w:name="考虑物性变化与径向收缩的圆柱药材热风干燥模型"/>
+    <w:bookmarkStart w:id="26" w:name="考虑物性变化与径向收缩的圆柱药材热风干燥模型"/>
     <w:p>
       <w:pPr>
         <w:pStyle w:val="Heading1"/>
@@ -1236,7 +1236,7 @@
         <w:rPr>
           <w:rFonts w:hint="eastAsia"/>
         </w:rPr>
-        <w:t xml:space="preserve">h），最大含水率约0.149970</w:t>
+        <w:t xml:space="preserve">h），最大含水率约0.149987</w:t>
       </w:r>
       <w:r>
         <w:t xml:space="preserve"> kg/kg。</w:t>
@@ -1302,7 +1302,7 @@
         <w:rPr>
           <w:rFonts w:hint="eastAsia"/>
         </w:rPr>
-        <w:t xml:space="preserve">h），最大含水率约0.149958</w:t>
+        <w:t xml:space="preserve">h），最大含水率约0.149989</w:t>
       </w:r>
       <w:r>
         <w:t xml:space="preserve"> </w:t>
@@ -1347,12 +1347,48 @@
         <w:rPr>
           <w:rFonts w:hint="eastAsia"/>
         </w:rPr>
-        <w:t xml:space="preserve">2.7×10⁻¹⁵，正性检查通过，潜热关闭与基线逐点一致。二维轴对称诊断使用8×12和12×18网格，二维求解器运行成功。二维结果只用于结构诊断，不能写成已经完成的移动二维自适应降维结论。</w:t>
+        <w:t xml:space="preserve">2.7×10⁻¹⁵，正性检查通过，潜热关闭与基线逐点一致。二维轴对称诊断使用8×12和12×18网格，二维求解器运行成功。当前求解器下，N=40、80、120、160的Q3事件分别为57.7081、57.4480、57.3720、57.3381</w:t>
+      </w:r>
+      <w:r>
+        <w:t xml:space="preserve"> </w:t>
+      </w:r>
+      <w:r>
+        <w:rPr>
+          <w:rFonts w:hint="eastAsia"/>
+        </w:rPr>
+        <w:t xml:space="preserve">h，Q4分别为50.9944、50.9339、50.9177、50.9110</w:t>
+      </w:r>
+      <w:r>
+        <w:t xml:space="preserve"> </w:t>
+      </w:r>
+      <w:r>
+        <w:rPr>
+          <w:rFonts w:hint="eastAsia"/>
+        </w:rPr>
+        <w:t xml:space="preserve">h；N=120到N=160的变化分别为122.05</w:t>
+      </w:r>
+      <w:r>
+        <w:t xml:space="preserve"> </w:t>
+      </w:r>
+      <w:r>
+        <w:rPr>
+          <w:rFonts w:hint="eastAsia"/>
+        </w:rPr>
+        <w:t xml:space="preserve">s和24.13</w:t>
+      </w:r>
+      <w:r>
+        <w:t xml:space="preserve"> </w:t>
+      </w:r>
+      <w:r>
+        <w:rPr>
+          <w:rFonts w:hint="eastAsia"/>
+        </w:rPr>
+        <w:t xml:space="preserve">s。二维结果只用于结构诊断，不能写成已经完成的移动二维自适应降维结论。</w:t>
       </w:r>
     </w:p>
     <w:bookmarkEnd w:id="20"/>
     <w:bookmarkEnd w:id="21"/>
-    <w:bookmarkStart w:id="22" w:name="讨论创新与局限"/>
+    <w:bookmarkStart w:id="22" w:name="机制归因讨论与局限"/>
     <w:p>
       <w:pPr>
         <w:pStyle w:val="Heading2"/>
@@ -1364,6 +1400,78 @@
         <w:rPr>
           <w:rFonts w:hint="eastAsia"/>
         </w:rPr>
+        <w:t xml:space="preserve">机制归因、讨论与局限</w:t>
+      </w:r>
+    </w:p>
+    <w:p>
+      <w:pPr>
+        <w:pStyle w:val="FirstParagraph"/>
+      </w:pPr>
+      <w:r>
+        <w:rPr>
+          <w:rFonts w:hint="eastAsia"/>
+        </w:rPr>
+        <w:t xml:space="preserve">在当前求解器、N=80和相同事件定义下，物性—几何2×2对照得到：附录3固定半径57.4480</w:t>
+      </w:r>
+      <w:r>
+        <w:t xml:space="preserve"> </w:t>
+      </w:r>
+      <w:r>
+        <w:rPr>
+          <w:rFonts w:hint="eastAsia"/>
+        </w:rPr>
+        <w:t xml:space="preserve">h，附录3收缩25.2475</w:t>
+      </w:r>
+      <w:r>
+        <w:t xml:space="preserve"> </w:t>
+      </w:r>
+      <w:r>
+        <w:rPr>
+          <w:rFonts w:hint="eastAsia"/>
+        </w:rPr>
+        <w:t xml:space="preserve">h，附录4固定半径129.3336</w:t>
+      </w:r>
+      <w:r>
+        <w:t xml:space="preserve"> </w:t>
+      </w:r>
+      <w:r>
+        <w:rPr>
+          <w:rFonts w:hint="eastAsia"/>
+        </w:rPr>
+        <w:t xml:space="preserve">h，附录4收缩50.9339</w:t>
+      </w:r>
+      <w:r>
+        <w:t xml:space="preserve"> </w:t>
+      </w:r>
+      <w:r>
+        <w:rPr>
+          <w:rFonts w:hint="eastAsia"/>
+        </w:rPr>
+        <w:t xml:space="preserve">h。收缩在两组物性下均缩短终点，但缩短量不同；交互项约−46.20</w:t>
+      </w:r>
+      <w:r>
+        <w:t xml:space="preserve"> </w:t>
+      </w:r>
+      <w:r>
+        <w:rPr>
+          <w:rFonts w:hint="eastAsia"/>
+        </w:rPr>
+        <w:t xml:space="preserve">h，说明物性与几何不能用单一比例叠加。该对照是反事实机制分析，不是实测工艺。</w:t>
+      </w:r>
+    </w:p>
+    <w:bookmarkEnd w:id="22"/>
+    <w:bookmarkStart w:id="23" w:name="讨论创新与局限"/>
+    <w:p>
+      <w:pPr>
+        <w:pStyle w:val="Heading2"/>
+      </w:pPr>
+      <w:r>
+        <w:t xml:space="preserve">8 </w:t>
+      </w:r>
+      <w:r>
+        <w:rPr>
+          <w:rFonts w:hint="eastAsia"/>
+        </w:rPr>
         <w:t xml:space="preserve">讨论、创新与局限</w:t>
       </w:r>
     </w:p>
@@ -1389,8 +1497,8 @@
         <w:t xml:space="preserve">模型局限包括：空气水分浓度与材料干基含水率的分母不同，Robin目标是有效闭合；潜热、吸附等温线、端面传质和轴向长度没有实测数据；边界和半径观测之外采用末值延拓。因而结果是给定经验公式和假设下的预测，不是实验校准或工程最优性证明。</w:t>
       </w:r>
     </w:p>
-    <w:bookmarkEnd w:id="22"/>
-    <w:bookmarkStart w:id="23" w:name="结论"/>
+    <w:bookmarkEnd w:id="23"/>
+    <w:bookmarkStart w:id="24" w:name="结论"/>
     <w:p>
       <w:pPr>
         <w:pStyle w:val="Heading2"/>
@@ -1452,8 +1560,8 @@
         <w:t xml:space="preserve">中。</w:t>
       </w:r>
     </w:p>
-    <w:bookmarkEnd w:id="23"/>
-    <w:bookmarkStart w:id="24" w:name="参考文献"/>
+    <w:bookmarkEnd w:id="24"/>
+    <w:bookmarkStart w:id="25" w:name="参考文献"/>
     <w:p>
       <w:pPr>
         <w:pStyle w:val="Heading2"/>
@@ -1515,8 +1623,8 @@
         <w:t xml:space="preserve"> 2026.</w:t>
       </w:r>
     </w:p>
-    <w:bookmarkEnd w:id="24"/>
     <w:bookmarkEnd w:id="25"/>
+    <w:bookmarkEnd w:id="26"/>
     <w:sectPr>
       <w:footnotePr>
         <w:numRestart w:val="eachSect"/>

</xml_diff>